<commit_message>
Generate 100% native Word .docx document using docxtpl matching exact SHTP-IC 11-page form
</commit_message>
<xml_diff>
--- a/template_shtpic.docx
+++ b/template_shtpic.docx
@@ -8,8 +8,8 @@
       </w:pPr>
       <w:r>
         <w:rPr>
-          <w:rFonts w:ascii="Times New Roman" w:hAnsi="Times New Roman"/>
           <w:b/>
+          <w:color w:val="003366"/>
           <w:sz w:val="26"/>
         </w:rPr>
         <w:t>VƯỜN ƯƠM DOANH NGHIỆP CÔNG NGHỆ CAO</w:t>
@@ -17,206 +17,515 @@
       </w:r>
       <w:r>
         <w:rPr>
-          <w:rFonts w:ascii="Times New Roman" w:hAnsi="Times New Roman"/>
           <w:i/>
+          <w:color w:val="646464"/>
           <w:sz w:val="20"/>
         </w:rPr>
         <w:t>E2a-10 Đường D2b, Khu Công nghệ cao, P.Tăng Nhơn Phú, TP.HCM</w:t>
         <w:br/>
-        <w:t>Điện thoại: 028 7100 7986 - Website: www.shtpic.org</w:t>
+        <w:t>Điện thoại: 028 7100 7986     Website: www.shtpic.org</w:t>
         <w:br/>
       </w:r>
     </w:p>
-    <w:p/>
     <w:p>
       <w:pPr>
         <w:jc w:val="center"/>
       </w:pPr>
       <w:r>
         <w:rPr>
-          <w:rFonts w:ascii="Times New Roman" w:hAnsi="Times New Roman"/>
+          <w:color w:val="003366"/>
+        </w:rPr>
+        <w:t>____________________________________________________________________</w:t>
+        <w:br/>
+      </w:r>
+    </w:p>
+    <w:p>
+      <w:pPr>
+        <w:jc w:val="center"/>
+      </w:pPr>
+      <w:r>
+        <w:rPr>
           <w:b/>
           <w:sz w:val="32"/>
         </w:rPr>
+        <w:br/>
         <w:t>THUYẾT MINH DỰ ÁN</w:t>
         <w:br/>
       </w:r>
       <w:r>
         <w:rPr>
-          <w:rFonts w:ascii="Times New Roman" w:hAnsi="Times New Roman"/>
+          <w:b/>
           <w:i/>
           <w:sz w:val="24"/>
         </w:rPr>
         <w:t>Tham gia chương trình ươm tạo tại Vườn ươm Doanh nghiệp Công nghệ cao</w:t>
         <w:br/>
+        <w:br/>
       </w:r>
     </w:p>
     <w:p>
       <w:pPr>
-        <w:pStyle w:val="Heading1"/>
+        <w:spacing w:before="240" w:after="80"/>
       </w:pPr>
       <w:r>
+        <w:rPr>
+          <w:b/>
+          <w:sz w:val="26"/>
+        </w:rPr>
         <w:t>I. THÔNG TIN CHUNG VỀ DỰ ÁN</w:t>
       </w:r>
     </w:p>
     <w:p>
+      <w:pPr>
+        <w:spacing w:after="80"/>
+      </w:pPr>
       <w:r>
-        <w:t>1. Tên dự án: {{ ten_du_an }}</w:t>
+        <w:rPr>
+          <w:b/>
+        </w:rPr>
+        <w:t xml:space="preserve">1. Tên dự án: </w:t>
+      </w:r>
+      <w:r>
+        <w:t>{{ ten_du_an }}</w:t>
+      </w:r>
+    </w:p>
+    <w:p>
+      <w:pPr>
+        <w:spacing w:after="80"/>
+      </w:pPr>
+      <w:r>
+        <w:rPr>
+          <w:b/>
+        </w:rPr>
+        <w:t xml:space="preserve">2. Sản phẩm/dịch vụ chính của dự án: </w:t>
+      </w:r>
+      <w:r>
+        <w:t>{{ san_pham_chinh }}</w:t>
+      </w:r>
+    </w:p>
+    <w:p>
+      <w:pPr>
+        <w:spacing w:after="80"/>
+      </w:pPr>
+      <w:r>
+        <w:rPr>
+          <w:b/>
+        </w:rPr>
+        <w:t xml:space="preserve">3. Công nghệ chính của dự án: </w:t>
+      </w:r>
+      <w:r>
+        <w:t>{{ cong_nghe_chinh }}</w:t>
+      </w:r>
+    </w:p>
+    <w:p>
+      <w:pPr>
+        <w:spacing w:after="80"/>
+      </w:pPr>
+      <w:r>
+        <w:rPr>
+          <w:b/>
+        </w:rPr>
+        <w:t xml:space="preserve">4. Lĩnh vực: </w:t>
+      </w:r>
+      <w:r>
+        <w:t>{{ linh_vuc }}</w:t>
+      </w:r>
+    </w:p>
+    <w:p>
+      <w:pPr>
+        <w:spacing w:before="240" w:after="80"/>
+      </w:pPr>
+      <w:r>
+        <w:rPr>
+          <w:b/>
+          <w:sz w:val="26"/>
+        </w:rPr>
+        <w:t>II. THÔNG TIN CHI TIẾT DỰ ÁN</w:t>
       </w:r>
     </w:p>
     <w:p>
       <w:r>
-        <w:t>2. Sản phẩm/dịch vụ chính: {{ san_pham_chinh }}</w:t>
-      </w:r>
-    </w:p>
-    <w:p>
-      <w:r>
-        <w:t>3. Công nghệ chính của dự án: {{ cong_nghe_chinh }}</w:t>
-      </w:r>
-    </w:p>
-    <w:p>
-      <w:r>
-        <w:t>4. Lĩnh vực: {{ linh_vuc }}</w:t>
+        <w:rPr>
+          <w:b/>
+          <w:i/>
+        </w:rPr>
+        <w:t>1. Giới thiệu tóm tắt về dự án (tập trung làm rõ các nội dung sau)</w:t>
       </w:r>
     </w:p>
     <w:p>
       <w:pPr>
-        <w:pStyle w:val="Heading1"/>
+        <w:spacing w:after="80"/>
       </w:pPr>
       <w:r>
-        <w:t>II. THÔNG TIN CHI TIẾT DỰ ÁN</w:t>
+        <w:rPr>
+          <w:b/>
+        </w:rPr>
+        <w:t xml:space="preserve">- Vấn đề dự án đang muốn giải quyết và giải pháp dự án nêu ra: </w:t>
+      </w:r>
+      <w:r>
+        <w:t>{{ van_de_giai_phap }}</w:t>
       </w:r>
     </w:p>
     <w:p>
       <w:pPr>
-        <w:pStyle w:val="Heading2"/>
+        <w:spacing w:after="80"/>
       </w:pPr>
       <w:r>
-        <w:t>1. Giới thiệu tóm tắt về dự án</w:t>
+        <w:rPr>
+          <w:b/>
+        </w:rPr>
+        <w:t xml:space="preserve">- Tính cấp thiết thực hiện dự án (nếu có): </w:t>
       </w:r>
-    </w:p>
-    <w:p>
       <w:r>
-        <w:t>- Vấn đề dự án đang muốn giải quyết và giải pháp dự án nêu ra:</w:t>
-        <w:br/>
-        <w:t>{{ van_de_giai_phap }}</w:t>
-      </w:r>
-    </w:p>
-    <w:p>
-      <w:r>
-        <w:t>- Tính cấp thiết thực hiện dự án:</w:t>
-        <w:br/>
         <w:t>{{ tinh_cap_thiet }}</w:t>
       </w:r>
     </w:p>
     <w:p>
+      <w:pPr>
+        <w:spacing w:after="80"/>
+      </w:pPr>
       <w:r>
-        <w:t>- Mục tiêu kinh tế - xã hội của dự án:</w:t>
-        <w:br/>
+        <w:rPr>
+          <w:b/>
+        </w:rPr>
+        <w:t xml:space="preserve">- Mục tiêu kinh tế - xã hội của dự án (nếu có): </w:t>
+      </w:r>
+      <w:r>
         <w:t>{{ muc_tieu_ktxh }}</w:t>
       </w:r>
     </w:p>
     <w:p>
+      <w:pPr>
+        <w:spacing w:after="80"/>
+      </w:pPr>
       <w:r>
-        <w:t>- Mục tiêu về khoa học công nghệ của dự án:</w:t>
-        <w:br/>
+        <w:rPr>
+          <w:b/>
+        </w:rPr>
+        <w:t xml:space="preserve">- Mục tiêu về khoa học công nghệ của dự án (nếu có): </w:t>
+      </w:r>
+      <w:r>
         <w:t>{{ muc_tieu_khcn }}</w:t>
       </w:r>
     </w:p>
     <w:p>
       <w:pPr>
-        <w:pStyle w:val="Heading2"/>
+        <w:spacing w:before="240" w:after="80"/>
       </w:pPr>
       <w:r>
-        <w:t>2. Công nghệ, sản phẩm đăng ký ươm tạo của dự án</w:t>
+        <w:rPr>
+          <w:b/>
+          <w:sz w:val="26"/>
+        </w:rPr>
+        <w:t>2. Công nghệ, sản phẩm đăng ký ươm tạo của dự án.</w:t>
+      </w:r>
+    </w:p>
+    <w:p>
+      <w:r>
+        <w:rPr>
+          <w:b/>
+        </w:rPr>
+        <w:t>2.1. Sản phẩm đăng ký ươm tạo của dự án</w:t>
+        <w:br/>
+      </w:r>
+    </w:p>
+    <w:p>
+      <w:r>
+        <w:rPr>
+          <w:i/>
+          <w:sz w:val="22"/>
+        </w:rPr>
+        <w:t>Yêu cầu: Sản phẩm ươm tạo của dự án PHẢI thuộc Danh mục sản phẩm công nghệ cao được khuyến khích phát triển ban hành tại Phụ lục II – Quyết định số 23/2026/QĐ-TTg ngày 15 tháng 5 năm 2026 của Thủ tướng Chính phủ.</w:t>
+        <w:br/>
+      </w:r>
+    </w:p>
+    <w:tbl>
+      <w:tblPr>
+        <w:tblW w:type="auto" w:w="0"/>
+        <w:jc w:val="center"/>
+        <w:tblLook w:firstColumn="1" w:firstRow="1" w:lastColumn="0" w:lastRow="0" w:noHBand="0" w:noVBand="1" w:val="04A0"/>
+      </w:tblPr>
+      <w:tblGrid>
+        <w:gridCol w:w="3024"/>
+        <w:gridCol w:w="3024"/>
+        <w:gridCol w:w="3024"/>
+      </w:tblGrid>
+      <w:tr>
+        <w:tc>
+          <w:tcPr>
+            <w:tcW w:type="dxa" w:w="3168"/>
+          </w:tcPr>
+          <w:p>
+            <w:r>
+              <w:t>Tên sản phẩm ươm tạo của dự án</w:t>
+            </w:r>
+          </w:p>
+        </w:tc>
+        <w:tc>
+          <w:tcPr>
+            <w:tcW w:type="dxa" w:w="3168"/>
+          </w:tcPr>
+          <w:p>
+            <w:r>
+              <w:t>Tên sản phẩm theo Phụ lục II – QĐ 23/2026/QĐ-TTg</w:t>
+            </w:r>
+          </w:p>
+        </w:tc>
+        <w:tc>
+          <w:tcPr>
+            <w:tcW w:type="dxa" w:w="3168"/>
+          </w:tcPr>
+          <w:p>
+            <w:r>
+              <w:t>Số TT</w:t>
+            </w:r>
+          </w:p>
+        </w:tc>
+      </w:tr>
+      <w:tr>
+        <w:tc>
+          <w:tcPr>
+            <w:tcW w:type="dxa" w:w="3168"/>
+          </w:tcPr>
+          <w:p>
+            <w:r>
+              <w:t>{{ san_pham_chinh }}</w:t>
+            </w:r>
+          </w:p>
+        </w:tc>
+        <w:tc>
+          <w:tcPr>
+            <w:tcW w:type="dxa" w:w="3168"/>
+          </w:tcPr>
+          <w:p>
+            <w:r>
+              <w:t>Tên theo Phụ lục II QĐ 23/2026</w:t>
+            </w:r>
+          </w:p>
+        </w:tc>
+        <w:tc>
+          <w:tcPr>
+            <w:tcW w:type="dxa" w:w="3168"/>
+          </w:tcPr>
+          <w:p>
+            <w:r>
+              <w:t>01</w:t>
+            </w:r>
+          </w:p>
+        </w:tc>
+      </w:tr>
+    </w:tbl>
+    <w:p>
+      <w:r>
+        <w:rPr>
+          <w:b/>
+        </w:rPr>
+        <w:br/>
+        <w:t>Mô tả sản phẩm công nghệ cao đăng ký ươm tạo</w:t>
       </w:r>
     </w:p>
     <w:p>
       <w:pPr>
-        <w:pStyle w:val="Heading3"/>
+        <w:spacing w:after="80"/>
       </w:pPr>
       <w:r>
-        <w:t>2.1. Sản phẩm đăng ký ươm tạo của dự án</w:t>
+        <w:rPr>
+          <w:b/>
+        </w:rPr>
+        <w:t xml:space="preserve">- Giải trình minh chứng sản phẩm đăng ký ươm tạo phù hợp sản phẩm công nghệ cao: </w:t>
+      </w:r>
+      <w:r>
+        <w:t>{{ minh_chung_san_pham }}</w:t>
+      </w:r>
+    </w:p>
+    <w:p>
+      <w:pPr>
+        <w:spacing w:after="80"/>
+      </w:pPr>
+      <w:r>
+        <w:rPr>
+          <w:b/>
+        </w:rPr>
+        <w:t xml:space="preserve">- Mô tả quy trình hoạt động của sản phẩm, cấu phần hình thành, sơ đồ: </w:t>
+      </w:r>
+      <w:r>
+        <w:t>{{ quy_trinh_san_pham }}</w:t>
+      </w:r>
+    </w:p>
+    <w:p>
+      <w:pPr>
+        <w:spacing w:after="80"/>
+      </w:pPr>
+      <w:r>
+        <w:rPr>
+          <w:b/>
+        </w:rPr>
+        <w:t xml:space="preserve">- Chất lượng, tính năng vượt trội, giá trị gia tăng &amp; khả năng thay thế nhập khẩu: </w:t>
+      </w:r>
+      <w:r>
+        <w:t>{{ tinh_nang_vuot_troi }}</w:t>
       </w:r>
     </w:p>
     <w:p>
       <w:r>
-        <w:t>Mô tả sản phẩm công nghệ cao đăng ký ươm tạo:</w:t>
+        <w:rPr>
+          <w:b/>
+        </w:rPr>
         <w:br/>
-        <w:t>- Giải trình minh chứng:</w:t>
+        <w:t>2.2. Công nghệ đăng ký ươm tạo của dự án</w:t>
+      </w:r>
+    </w:p>
+    <w:tbl>
+      <w:tblPr>
+        <w:tblW w:type="auto" w:w="0"/>
+        <w:jc w:val="center"/>
+        <w:tblLook w:firstColumn="1" w:firstRow="1" w:lastColumn="0" w:lastRow="0" w:noHBand="0" w:noVBand="1" w:val="04A0"/>
+      </w:tblPr>
+      <w:tblGrid>
+        <w:gridCol w:w="3024"/>
+        <w:gridCol w:w="3024"/>
+        <w:gridCol w:w="3024"/>
+      </w:tblGrid>
+      <w:tr>
+        <w:tc>
+          <w:tcPr>
+            <w:tcW w:type="dxa" w:w="3024"/>
+          </w:tcPr>
+          <w:p>
+            <w:r>
+              <w:t>Tên công nghệ của dự án</w:t>
+            </w:r>
+          </w:p>
+        </w:tc>
+        <w:tc>
+          <w:tcPr>
+            <w:tcW w:type="dxa" w:w="3024"/>
+          </w:tcPr>
+          <w:p>
+            <w:r>
+              <w:t>Tên công nghệ theo Phụ lục I - QĐ 23/2026/QĐ-TTg</w:t>
+            </w:r>
+          </w:p>
+        </w:tc>
+        <w:tc>
+          <w:tcPr>
+            <w:tcW w:type="dxa" w:w="3024"/>
+          </w:tcPr>
+          <w:p>
+            <w:r>
+              <w:t>Số TT</w:t>
+            </w:r>
+          </w:p>
+        </w:tc>
+      </w:tr>
+      <w:tr>
+        <w:tc>
+          <w:tcPr>
+            <w:tcW w:type="dxa" w:w="3024"/>
+          </w:tcPr>
+          <w:p>
+            <w:r>
+              <w:t>{{ cong_nghe_chinh }}</w:t>
+            </w:r>
+          </w:p>
+        </w:tc>
+        <w:tc>
+          <w:tcPr>
+            <w:tcW w:type="dxa" w:w="3024"/>
+          </w:tcPr>
+          <w:p>
+            <w:r>
+              <w:t>Tên công nghệ Phụ lục I QĐ 23/2026</w:t>
+            </w:r>
+          </w:p>
+        </w:tc>
+        <w:tc>
+          <w:tcPr>
+            <w:tcW w:type="dxa" w:w="3024"/>
+          </w:tcPr>
+          <w:p>
+            <w:r>
+              <w:t>01</w:t>
+            </w:r>
+          </w:p>
+        </w:tc>
+      </w:tr>
+    </w:tbl>
+    <w:p>
+      <w:r>
+        <w:rPr>
+          <w:b/>
+        </w:rPr>
         <w:br/>
-        <w:t>{{ minh_chung_san_pham }}</w:t>
-        <w:br/>
-        <w:t>- Quy trình hoạt động &amp; Cấu phần:</w:t>
-        <w:br/>
-        <w:t>{{ quy_trinh_san_pham }}</w:t>
-        <w:br/>
-        <w:t>- Chất lượng, tính năng vượt trội:</w:t>
-        <w:br/>
-        <w:t>{{ tinh_nang_vuot_troi }}</w:t>
+        <w:t>Hiện trạng ứng dụng, ươm tạo công nghệ cao của dự án.</w:t>
       </w:r>
     </w:p>
     <w:p>
       <w:pPr>
-        <w:pStyle w:val="Heading3"/>
+        <w:spacing w:after="80"/>
       </w:pPr>
       <w:r>
-        <w:t>2.2. Công nghệ đăng ký ươm tạo của dự án</w:t>
+        <w:rPr>
+          <w:b/>
+        </w:rPr>
+        <w:t xml:space="preserve">- Giải trình minh chứng công nghệ đăng ký ươm tạo phù hợp: </w:t>
+      </w:r>
+      <w:r>
+        <w:t>{{ minh_chung_cong_nghe }}</w:t>
       </w:r>
     </w:p>
     <w:p>
+      <w:pPr>
+        <w:spacing w:after="80"/>
+      </w:pPr>
       <w:r>
-        <w:t>Hiện trạng ứng dụng, ươm tạo công nghệ cao:</w:t>
-        <w:br/>
-        <w:t>- Minh chứng công nghệ phù hợp:</w:t>
-        <w:br/>
-        <w:t>{{ minh_chung_cong_nghe }}</w:t>
-        <w:br/>
-        <w:t>- Quy trình công nghệ &amp; Điểm nổi bật:</w:t>
-        <w:br/>
+        <w:rPr>
+          <w:b/>
+        </w:rPr>
+        <w:t xml:space="preserve">- Mô tả chi tiết quy trình công nghệ &amp; điểm nổi bật: </w:t>
+      </w:r>
+      <w:r>
         <w:t>{{ quy_trinh_cong_nghe }}</w:t>
-        <w:br/>
-        <w:t>- Tính khả thi kỹ thuật:</w:t>
-        <w:br/>
+      </w:r>
+    </w:p>
+    <w:p>
+      <w:pPr>
+        <w:spacing w:after="80"/>
+      </w:pPr>
+      <w:r>
+        <w:rPr>
+          <w:b/>
+        </w:rPr>
+        <w:t xml:space="preserve">- Tính khả thi kỹ thuật công nghệ triển khai: </w:t>
+      </w:r>
+      <w:r>
         <w:t>{{ tinh_kha_thi_ky_thuat }}</w:t>
-        <w:br/>
-        <w:t>- Bảo mật &amp; Khả năng mở rộng:</w:t>
-        <w:br/>
+      </w:r>
+    </w:p>
+    <w:p>
+      <w:pPr>
+        <w:spacing w:after="80"/>
+      </w:pPr>
+      <w:r>
+        <w:rPr>
+          <w:b/>
+        </w:rPr>
+        <w:t xml:space="preserve">- Khả năng bảo mật, an toàn dữ liệu, tính mở rộng: </w:t>
+      </w:r>
+      <w:r>
         <w:t>{{ bao_mat_mo_rong }}</w:t>
       </w:r>
     </w:p>
     <w:p>
       <w:pPr>
-        <w:pStyle w:val="Heading2"/>
+        <w:spacing w:before="240" w:after="80"/>
       </w:pPr>
       <w:r>
-        <w:t>5. Tiềm năng thương mại &amp; Phân tích đối thủ</w:t>
-      </w:r>
-    </w:p>
-    <w:p>
-      <w:r>
-        <w:t>- Tiềm năng thị trường:</w:t>
-        <w:br/>
-        <w:t>{{ tiem_nang_thi_truong }}</w:t>
-      </w:r>
-    </w:p>
-    <w:p>
-      <w:r>
-        <w:t>- Phân tích Đối thủ 1: {{ doi_thu_1 }}</w:t>
-        <w:br/>
-        <w:t>- Phân tích Đối thủ 2: {{ doi_thu_2 }}</w:t>
-        <w:br/>
-        <w:t>- Lợi thế cạnh tranh:</w:t>
-        <w:br/>
-        <w:t>{{ loi_the_canh_tranh }}</w:t>
-      </w:r>
-    </w:p>
-    <w:p>
-      <w:pPr>
-        <w:pStyle w:val="Heading2"/>
-      </w:pPr>
-      <w:r>
-        <w:t>III.2. CÁC NỘI DUNG DỰ ÁN ĐỀ XUẤT CẦN HỖ TRỢ</w:t>
+        <w:rPr>
+          <w:b/>
+          <w:sz w:val="26"/>
+        </w:rPr>
+        <w:t>III.2. CÁC NỘI DUNG DỰ ÁN ĐỀ XUẤT CẦN HỖ TRỢ KHI THAM GIA ƯƠM TẠO</w:t>
       </w:r>
     </w:p>
     <w:tbl>
@@ -278,9 +587,64 @@
       <w:r>
         <w:br/>
         <w:br/>
-        <w:t xml:space="preserve"> Tôi/Chúng tôi xin chịu trách nhiệm hoàn toàn về toàn bộ thông tin nêu trên.</w:t>
+        <w:t>Tôi/Chúng tôi xin chịu trách nhiệm hoàn toàn về toàn bộ thông tin nêu trên.</w:t>
       </w:r>
     </w:p>
+    <w:p>
+      <w:pPr>
+        <w:jc w:val="right"/>
+      </w:pPr>
+      <w:r>
+        <w:rPr>
+          <w:i/>
+        </w:rPr>
+        <w:t>....................., ngày ...... tháng ...... năm 2026</w:t>
+        <w:br/>
+      </w:r>
+    </w:p>
+    <w:tbl>
+      <w:tblPr>
+        <w:tblW w:type="auto" w:w="0"/>
+        <w:jc w:val="center"/>
+        <w:tblLook w:firstColumn="1" w:firstRow="1" w:lastColumn="0" w:lastRow="0" w:noHBand="0" w:noVBand="1" w:val="04A0"/>
+      </w:tblPr>
+      <w:tblGrid>
+        <w:gridCol w:w="4536"/>
+        <w:gridCol w:w="4536"/>
+      </w:tblGrid>
+      <w:tr>
+        <w:tc>
+          <w:tcPr>
+            <w:tcW w:type="dxa" w:w="4536"/>
+          </w:tcPr>
+          <w:p>
+            <w:r>
+              <w:rPr>
+                <w:b/>
+              </w:rPr>
+              <w:t>CHỦ NHIỆM DỰ ÁN</w:t>
+              <w:br/>
+              <w:t>(Ký và ghi rõ họ tên)</w:t>
+            </w:r>
+          </w:p>
+        </w:tc>
+        <w:tc>
+          <w:tcPr>
+            <w:tcW w:type="dxa" w:w="4536"/>
+          </w:tcPr>
+          <w:p>
+            <w:r>
+              <w:rPr>
+                <w:b/>
+              </w:rPr>
+              <w:t>ĐƠN VỊ CHỦ TRÌ</w:t>
+              <w:br/>
+              <w:t>(Ký và ghi rõ họ tên, đóng dấu)</w:t>
+            </w:r>
+          </w:p>
+        </w:tc>
+      </w:tr>
+    </w:tbl>
     <w:sectPr>
       <w:pgSz w:w="12240" w:h="15840"/>
       <w:pgMar w:top="1440" w:right="1440" w:bottom="1440" w:left="1728" w:header="720" w:footer="720" w:gutter="0"/>

</xml_diff>